<commit_message>
Fix Section 7: add body text to empty heading
Section 7 ('Effect size and outcome-determinative criterion') was left
with only a heading after 7.1/7.2/7.3 were removed. Added proper body
text defining the margin-shift effect size interpretation and the
two-part outcome-determinative criterion (q ≤ 0.05 AND B_j(A,B) >
margin, directional), with forward reference to Section 9.3.

Co-Authored-By: Claude Sonnet 4.6 <noreply@anthropic.com>
</commit_message>
<xml_diff>
--- a/paper_draft_v7.docx
+++ b/paper_draft_v7.docx
@@ -281,6 +281,12 @@
       </w:pPr>
       <w:r>
         <w:t>7. Effect size and outcome-determinative criterion</w:t>
+      </w:r>
+    </w:p>
+    <w:p>
+      <w:r>
+        <w:t xml:space="preserve">B_j(A,B) is expressed in the same units as the published score difference between competitors — points of margin shift. This makes the statistic directly interpretable: a bias of +1.19 points means judge j shifted the A–B published margin by 1.19 points in A's favor, relative to what the panel would have produced with a neutral mark from j.
+This unit-consistency enables a natural outcome-determinative criterion: an event is classified as outcome-determinative if a judge j satisfies both (i) q ≤ 0.05 under BH-FDR correction within the event, and (ii) B_j(A,B) &gt; margin(A,B), where margin(A,B) is the observed gold–silver score difference. The second condition is directional — only bias in favor of the gold medalist can flip the result — so the absolute value is not taken. Events meeting both conditions are those where removing judge j's competitor-specific differential would have changed the winner. Results for all 142 events are reported in Section 9.3.</w:t>
       </w:r>
     </w:p>
     <w:p>

</xml_diff>